<commit_message>
Moving schema to ProjectPal
</commit_message>
<xml_diff>
--- a/Claude/Notes.docx
+++ b/Claude/Notes.docx
@@ -31,32 +31,186 @@
     <w:p/>
     <w:p>
       <w:r>
-        <w:t>- TaskMan.sln (VS2013 format) + 5 project references: TaskMan (the exe), Utils, PlanDisplay, DBTaskMan, DBAccess, CustomGUIControls.</w:t>
-      </w:r>
-    </w:p>
-    <w:p>
-      <w:r>
-        <w:t>- TaskMan.exe is a hybrid WinForms + WPF app (WinForms Forms host WPF UserControls via WindowsFormsIntegration/ElementHost).</w:t>
-      </w:r>
-    </w:p>
-    <w:p>
-      <w:r>
-        <w:t>- COM interop: Utils/DocumentSearch.cs actively drives Word via Microsoft.Office.Interop.Word (embedded PIA). A VBIDE COM reference sits on both TaskMan.csproj and Utils.csproj but I found no code using it — looks dead.</w:t>
-      </w:r>
-    </w:p>
-    <w:p>
-      <w:r>
-        <w:t>- Utils.csproj has a hardcoded hint-path reference to a prebuilt Security.dll (..\..\Security\Security\Release\Security.dll) — source exists at Libs/Security but that project isn't part of this solution at all.</w:t>
-      </w:r>
-    </w:p>
-    <w:p>
-      <w:r>
-        <w:t>- No packages.config anywhere — every reference is a GAC/framework/COM assembly ref, no NuGet packages to fight with.</w:t>
-      </w:r>
-    </w:p>
-    <w:p>
-      <w:r>
-        <w:t>- ClickOnce publish is configured (System.Deployment, BootstrapperPackages, publish URLs pointing at \\tatooine) — that whole mechanism changes shape outside .NET Framework.</w:t>
+        <w:t xml:space="preserve">- TaskMan.sln (VS2013 format) + 5 project references: </w:t>
+      </w:r>
+      <w:proofErr w:type="spellStart"/>
+      <w:r>
+        <w:t>TaskMan</w:t>
+      </w:r>
+      <w:proofErr w:type="spellEnd"/>
+      <w:r>
+        <w:t xml:space="preserve"> (the exe), Utils, </w:t>
+      </w:r>
+      <w:proofErr w:type="spellStart"/>
+      <w:r>
+        <w:t>PlanDisplay</w:t>
+      </w:r>
+      <w:proofErr w:type="spellEnd"/>
+      <w:r>
+        <w:t xml:space="preserve">, </w:t>
+      </w:r>
+      <w:proofErr w:type="spellStart"/>
+      <w:r>
+        <w:t>DBTaskMan</w:t>
+      </w:r>
+      <w:proofErr w:type="spellEnd"/>
+      <w:r>
+        <w:t xml:space="preserve">, </w:t>
+      </w:r>
+      <w:proofErr w:type="spellStart"/>
+      <w:r>
+        <w:t>DBAccess</w:t>
+      </w:r>
+      <w:proofErr w:type="spellEnd"/>
+      <w:r>
+        <w:t xml:space="preserve">, </w:t>
+      </w:r>
+      <w:proofErr w:type="spellStart"/>
+      <w:r>
+        <w:t>CustomGUIControls</w:t>
+      </w:r>
+      <w:proofErr w:type="spellEnd"/>
+      <w:r>
+        <w:t>.</w:t>
+      </w:r>
+    </w:p>
+    <w:p>
+      <w:r>
+        <w:t xml:space="preserve">- TaskMan.exe is a hybrid WinForms + WPF app (WinForms Forms host WPF </w:t>
+      </w:r>
+      <w:proofErr w:type="spellStart"/>
+      <w:r>
+        <w:t>UserControls</w:t>
+      </w:r>
+      <w:proofErr w:type="spellEnd"/>
+      <w:r>
+        <w:t xml:space="preserve"> via </w:t>
+      </w:r>
+      <w:proofErr w:type="spellStart"/>
+      <w:r>
+        <w:t>WindowsFormsIntegration</w:t>
+      </w:r>
+      <w:proofErr w:type="spellEnd"/>
+      <w:r>
+        <w:t>/</w:t>
+      </w:r>
+      <w:proofErr w:type="spellStart"/>
+      <w:r>
+        <w:t>ElementHost</w:t>
+      </w:r>
+      <w:proofErr w:type="spellEnd"/>
+      <w:r>
+        <w:t>).</w:t>
+      </w:r>
+    </w:p>
+    <w:p>
+      <w:r>
+        <w:t>- COM interop: Utils/</w:t>
+      </w:r>
+      <w:proofErr w:type="spellStart"/>
+      <w:r>
+        <w:t>DocumentSearch.cs</w:t>
+      </w:r>
+      <w:proofErr w:type="spellEnd"/>
+      <w:r>
+        <w:t xml:space="preserve"> actively drives Word via </w:t>
+      </w:r>
+      <w:proofErr w:type="spellStart"/>
+      <w:proofErr w:type="gramStart"/>
+      <w:r>
+        <w:t>Microsoft.Office.Interop.Word</w:t>
+      </w:r>
+      <w:proofErr w:type="spellEnd"/>
+      <w:proofErr w:type="gramEnd"/>
+      <w:r>
+        <w:t xml:space="preserve"> (embedded PIA)</w:t>
+      </w:r>
+      <w:proofErr w:type="gramStart"/>
+      <w:r>
+        <w:t xml:space="preserve">. </w:t>
+      </w:r>
+      <w:proofErr w:type="gramEnd"/>
+      <w:r>
+        <w:t xml:space="preserve">A VBIDE COM reference sits on both </w:t>
+      </w:r>
+      <w:proofErr w:type="spellStart"/>
+      <w:r>
+        <w:t>TaskMan.csproj</w:t>
+      </w:r>
+      <w:proofErr w:type="spellEnd"/>
+      <w:r>
+        <w:t xml:space="preserve"> and </w:t>
+      </w:r>
+      <w:proofErr w:type="spellStart"/>
+      <w:r>
+        <w:t>Utils.csproj</w:t>
+      </w:r>
+      <w:proofErr w:type="spellEnd"/>
+      <w:r>
+        <w:t xml:space="preserve"> but I found no code using it — looks dead.</w:t>
+      </w:r>
+    </w:p>
+    <w:p>
+      <w:r>
+        <w:t xml:space="preserve">- </w:t>
+      </w:r>
+      <w:proofErr w:type="spellStart"/>
+      <w:r>
+        <w:t>Utils.csproj</w:t>
+      </w:r>
+      <w:proofErr w:type="spellEnd"/>
+      <w:r>
+        <w:t xml:space="preserve"> has a hardcoded hint-path reference to a prebuilt Security.dll (..\..\Security\Security\Release\Security.dll) — source exists at Libs/</w:t>
+      </w:r>
+      <w:proofErr w:type="gramStart"/>
+      <w:r>
+        <w:t>Security</w:t>
+      </w:r>
+      <w:proofErr w:type="gramEnd"/>
+      <w:r>
+        <w:t xml:space="preserve"> but that project isn't part of this solution at all.</w:t>
+      </w:r>
+    </w:p>
+    <w:p>
+      <w:r>
+        <w:t xml:space="preserve">- No </w:t>
+      </w:r>
+      <w:proofErr w:type="spellStart"/>
+      <w:r>
+        <w:t>packages.config</w:t>
+      </w:r>
+      <w:proofErr w:type="spellEnd"/>
+      <w:r>
+        <w:t xml:space="preserve"> anywhere — every reference is a GAC/framework/COM assembly ref, no NuGet packages to fight with.</w:t>
+      </w:r>
+    </w:p>
+    <w:p>
+      <w:r>
+        <w:t xml:space="preserve">- </w:t>
+      </w:r>
+      <w:proofErr w:type="spellStart"/>
+      <w:r>
+        <w:t>ClickOnce</w:t>
+      </w:r>
+      <w:proofErr w:type="spellEnd"/>
+      <w:r>
+        <w:t xml:space="preserve"> publish is configured (</w:t>
+      </w:r>
+      <w:proofErr w:type="spellStart"/>
+      <w:r>
+        <w:t>System.Deployment</w:t>
+      </w:r>
+      <w:proofErr w:type="spellEnd"/>
+      <w:r>
+        <w:t xml:space="preserve">, </w:t>
+      </w:r>
+      <w:proofErr w:type="spellStart"/>
+      <w:r>
+        <w:t>BootstrapperPackages</w:t>
+      </w:r>
+      <w:proofErr w:type="spellEnd"/>
+      <w:r>
+        <w:t>, publish URLs pointing at \\tatooine) — that whole mechanism changes shape outside .NET Framework.</w:t>
       </w:r>
     </w:p>
     <w:p/>
@@ -68,39 +222,203 @@
     <w:p/>
     <w:p>
       <w:r>
-        <w:t>Since this is Windows-only desktop (WinForms+WPF+COM), the realistic target is .NET 8 (LTS) with the Windows Desktop workload, not .NET Framework 4.8 (which is EOL-of-the-road, no further evolution) and not a cross-platform target (WPF/WinForms/COM interop tie it to Windows anyway).</w:t>
-      </w:r>
-    </w:p>
-    <w:p/>
-    <w:p>
-      <w:r>
-        <w:t>1. Convert all 6 .csproj files to SDK-style, targeting net8.0-windows, with &lt;UseWindowsForms&gt; / &lt;UseWPF&gt; set as needed. The dotnet-upgrade-assistant tool can automate most of this mechanically.</w:t>
+        <w:t>Since this is Windows-only desktop (</w:t>
+      </w:r>
+      <w:proofErr w:type="spellStart"/>
+      <w:r>
+        <w:t>WinForms+WPF+COM</w:t>
+      </w:r>
+      <w:proofErr w:type="spellEnd"/>
+      <w:r>
+        <w:t>), the realistic target is .NET 8 (LTS) with the Windows Desktop workload, not .NET Framework 4.8 (which is EOL-of-the-road, no further evolution) and not a cross-platform target (WPF/WinForms/COM interop tie it to Windows anyway).</w:t>
+      </w:r>
+    </w:p>
+    <w:p/>
+    <w:p>
+      <w:r>
+        <w:t>1. Convert all 6 .</w:t>
+      </w:r>
+      <w:proofErr w:type="spellStart"/>
+      <w:r>
+        <w:t>csproj</w:t>
+      </w:r>
+      <w:proofErr w:type="spellEnd"/>
+      <w:r>
+        <w:t xml:space="preserve"> files to SDK-style, targeting net8.0-windows, with &lt;</w:t>
+      </w:r>
+      <w:proofErr w:type="spellStart"/>
+      <w:r>
+        <w:t>UseWindowsForms</w:t>
+      </w:r>
+      <w:proofErr w:type="spellEnd"/>
+      <w:r>
+        <w:t>&gt; / &lt;UseWPF&gt; set as needed</w:t>
+      </w:r>
+      <w:proofErr w:type="gramStart"/>
+      <w:r>
+        <w:t xml:space="preserve">. </w:t>
+      </w:r>
+      <w:proofErr w:type="gramEnd"/>
+      <w:r>
+        <w:t>The dotnet-upgrade-assistant tool can automate most of this mechanically.</w:t>
       </w:r>
     </w:p>
     <w:p>
       <w:r>
         <w:lastRenderedPageBreak/>
-        <w:t>2. Drop the dead weight: the System.Data.Entity reference + orphaned App.Config1, and probably the unused VBIDE COM reference (worth confirming with you before deleting).</w:t>
-      </w:r>
-    </w:p>
-    <w:p>
-      <w:r>
-        <w:t>3. Re-resolve COM interop for Word — SDK-style projects support &lt;COMReference&gt; under net8.0-windows, but embedded interop types need regenerating; alternative is switching to the Microsoft.Office.Interop.Word NuGet PIA package.</w:t>
-      </w:r>
-    </w:p>
-    <w:p>
-      <w:r>
-        <w:t>4. Fix the Security.dll reference — either bring Libs/Security into the solution as a real ProjectReference and retarget it too, or rebuild/retarget that DLL for net8.0 independently. Right now it's a loose binary dependency outside source control's build graph.</w:t>
-      </w:r>
-    </w:p>
-    <w:p>
-      <w:r>
-        <w:t>5. Replace System.DirectoryServices/AccountManagement framework refs with their NuGet package equivalents (still Windows-only, still supported on net8.0-windows).</w:t>
-      </w:r>
-    </w:p>
-    <w:p>
-      <w:r>
-        <w:t>6. Decide on a deployment story to replace ClickOnce/System.Deployment — .NET has ClickOnce support again since .NET 6, but the publish profile mechanics differ from the old bootstrapper items; MSIX is the modern alternative if you want to reconsider.</w:t>
+        <w:t xml:space="preserve">2. Drop the dead weight: the </w:t>
+      </w:r>
+      <w:proofErr w:type="spellStart"/>
+      <w:proofErr w:type="gramStart"/>
+      <w:r>
+        <w:t>System.Data.Entity</w:t>
+      </w:r>
+      <w:proofErr w:type="spellEnd"/>
+      <w:proofErr w:type="gramEnd"/>
+      <w:r>
+        <w:t xml:space="preserve"> reference + orphaned App.Config1, and probably the unused VBIDE COM reference (worth confirming with you before deleting).</w:t>
+      </w:r>
+    </w:p>
+    <w:p>
+      <w:r>
+        <w:t>3. Re-resolve COM interop for Word — SDK-style projects support &lt;</w:t>
+      </w:r>
+      <w:proofErr w:type="spellStart"/>
+      <w:r>
+        <w:t>COMReference</w:t>
+      </w:r>
+      <w:proofErr w:type="spellEnd"/>
+      <w:r>
+        <w:t xml:space="preserve">&gt; under net8.0-windows, but embedded interop types need regenerating; alternative is switching to the </w:t>
+      </w:r>
+      <w:proofErr w:type="spellStart"/>
+      <w:proofErr w:type="gramStart"/>
+      <w:r>
+        <w:t>Microsoft.Office.Interop.Word</w:t>
+      </w:r>
+      <w:proofErr w:type="spellEnd"/>
+      <w:proofErr w:type="gramEnd"/>
+      <w:r>
+        <w:t xml:space="preserve"> NuGet PIA package.</w:t>
+      </w:r>
+    </w:p>
+    <w:p>
+      <w:pPr>
+        <w:rPr>
+          <w:strike/>
+        </w:rPr>
+      </w:pPr>
+      <w:r>
+        <w:rPr>
+          <w:strike/>
+        </w:rPr>
+        <w:t xml:space="preserve">4. Fix the Security.dll reference — either bring Libs/Security into the solution as a real </w:t>
+      </w:r>
+      <w:proofErr w:type="spellStart"/>
+      <w:r>
+        <w:rPr>
+          <w:strike/>
+        </w:rPr>
+        <w:t>ProjectReference</w:t>
+      </w:r>
+      <w:proofErr w:type="spellEnd"/>
+      <w:r>
+        <w:rPr>
+          <w:strike/>
+        </w:rPr>
+        <w:t xml:space="preserve"> and retarget it </w:t>
+      </w:r>
+      <w:proofErr w:type="gramStart"/>
+      <w:r>
+        <w:rPr>
+          <w:strike/>
+        </w:rPr>
+        <w:t>too, or</w:t>
+      </w:r>
+      <w:proofErr w:type="gramEnd"/>
+      <w:r>
+        <w:rPr>
+          <w:strike/>
+        </w:rPr>
+        <w:t xml:space="preserve"> rebuild/retarget that DLL for net8.0 independently</w:t>
+      </w:r>
+      <w:proofErr w:type="gramStart"/>
+      <w:r>
+        <w:rPr>
+          <w:strike/>
+        </w:rPr>
+        <w:t xml:space="preserve">. </w:t>
+      </w:r>
+      <w:proofErr w:type="gramEnd"/>
+      <w:r>
+        <w:rPr>
+          <w:strike/>
+        </w:rPr>
+        <w:t xml:space="preserve">Right </w:t>
+      </w:r>
+      <w:proofErr w:type="gramStart"/>
+      <w:r>
+        <w:rPr>
+          <w:strike/>
+        </w:rPr>
+        <w:t>now</w:t>
+      </w:r>
+      <w:proofErr w:type="gramEnd"/>
+      <w:r>
+        <w:rPr>
+          <w:strike/>
+        </w:rPr>
+        <w:t xml:space="preserve"> it's a loose binary dependency outside source control's build graph.</w:t>
+      </w:r>
+    </w:p>
+    <w:p>
+      <w:r>
+        <w:t xml:space="preserve">5. Replace </w:t>
+      </w:r>
+      <w:proofErr w:type="spellStart"/>
+      <w:r>
+        <w:t>System.DirectoryServices</w:t>
+      </w:r>
+      <w:proofErr w:type="spellEnd"/>
+      <w:r>
+        <w:t>/</w:t>
+      </w:r>
+      <w:proofErr w:type="spellStart"/>
+      <w:r>
+        <w:t>AccountManagement</w:t>
+      </w:r>
+      <w:proofErr w:type="spellEnd"/>
+      <w:r>
+        <w:t xml:space="preserve"> framework refs with their NuGet package equivalents (still Windows-only, still supported on net8.0-windows).</w:t>
+      </w:r>
+    </w:p>
+    <w:p>
+      <w:r>
+        <w:t xml:space="preserve">6. Decide on a deployment story to replace </w:t>
+      </w:r>
+      <w:proofErr w:type="spellStart"/>
+      <w:r>
+        <w:t>ClickOnce</w:t>
+      </w:r>
+      <w:proofErr w:type="spellEnd"/>
+      <w:r>
+        <w:t>/</w:t>
+      </w:r>
+      <w:proofErr w:type="spellStart"/>
+      <w:r>
+        <w:t>System.Deployment</w:t>
+      </w:r>
+      <w:proofErr w:type="spellEnd"/>
+      <w:r>
+        <w:t xml:space="preserve"> — .NET has </w:t>
+      </w:r>
+      <w:proofErr w:type="spellStart"/>
+      <w:r>
+        <w:t>ClickOnce</w:t>
+      </w:r>
+      <w:proofErr w:type="spellEnd"/>
+      <w:r>
+        <w:t xml:space="preserve"> support again since .NET 6, but the publish profile mechanics differ from the old bootstrapper items; MSIX is the modern alternative if you want to reconsider.</w:t>
       </w:r>
     </w:p>
     <w:p>
@@ -115,7 +433,15 @@
     </w:p>
     <w:p>
       <w:r>
-        <w:t>9. Clean up: delete the stray TaskMan - Copy.sln.</w:t>
+        <w:t xml:space="preserve">9. Clean up: delete the stray </w:t>
+      </w:r>
+      <w:proofErr w:type="spellStart"/>
+      <w:r>
+        <w:t>TaskMan</w:t>
+      </w:r>
+      <w:proofErr w:type="spellEnd"/>
+      <w:r>
+        <w:t xml:space="preserve"> - Copy.sln.</w:t>
       </w:r>
     </w:p>
     <w:p/>
@@ -127,7 +453,15 @@
     <w:p/>
     <w:p>
       <w:r>
-        <w:t>Want me to start with the mechanical SDK-style conversion (step 1) as a first PR, or do you want to resolve the Security.dll/VBIDE questions first since those affect how far the conversion can go before it actually builds?</w:t>
+        <w:t xml:space="preserve">Want me to start with the mechanical SDK-style conversion (step 1) as a first PR, or do you want to resolve the Security.dll/VBIDE questions first since those affect how far the conversion can go before it </w:t>
+      </w:r>
+      <w:proofErr w:type="gramStart"/>
+      <w:r>
+        <w:t>actually builds</w:t>
+      </w:r>
+      <w:proofErr w:type="gramEnd"/>
+      <w:r>
+        <w:t>?</w:t>
       </w:r>
     </w:p>
     <w:p>
@@ -171,12 +505,28 @@
     </w:p>
     <w:p>
       <w:r>
-        <w:t xml:space="preserve">  "C:\Program Files\Microsoft Visual Studio\18\Community\MSBuild\Microsoft\VC\v180\Microsoft.CppBuild.targets(473,5): error MSB8020: The</w:t>
-      </w:r>
-    </w:p>
-    <w:p>
-      <w:r>
-        <w:t xml:space="preserve">  build tools for Visual Studio 2013 (Platform Toolset = 'v120') cannot be found. To build using the v120 build tools, please install</w:t>
+        <w:t xml:space="preserve">  "C:\Program Files\Microsoft Visual </w:t>
+      </w:r>
+      <w:proofErr w:type="gramStart"/>
+      <w:r>
+        <w:t>Studio\18\Community\MSBuild\Microsoft\VC\v180\Microsoft.CppBuild.targets(</w:t>
+      </w:r>
+      <w:proofErr w:type="gramEnd"/>
+      <w:r>
+        <w:t>473,5): error MSB8020: The</w:t>
+      </w:r>
+    </w:p>
+    <w:p>
+      <w:r>
+        <w:t xml:space="preserve">  build tools for Visual Studio 2013 (Platform Toolset = 'v120') cannot be found</w:t>
+      </w:r>
+      <w:proofErr w:type="gramStart"/>
+      <w:r>
+        <w:t xml:space="preserve">. </w:t>
+      </w:r>
+      <w:proofErr w:type="gramEnd"/>
+      <w:r>
+        <w:t>To build using the v120 build tools, please install</w:t>
       </w:r>
     </w:p>
     <w:p>
@@ -191,12 +541,36 @@
     </w:p>
     <w:p>
       <w:r>
-        <w:t xml:space="preserve">  This is old code too, which I need to work with 'TaskMan'.</w:t>
-      </w:r>
-    </w:p>
-    <w:p>
-      <w:r>
-        <w:t xml:space="preserve">  How do I update 'Security' to the latest and also so it can be used with 'TaskMan'?</w:t>
+        <w:t xml:space="preserve">  This is old code too, which I need to work with '</w:t>
+      </w:r>
+      <w:proofErr w:type="spellStart"/>
+      <w:r>
+        <w:t>TaskMan</w:t>
+      </w:r>
+      <w:proofErr w:type="spellEnd"/>
+      <w:r>
+        <w:t>'.</w:t>
+      </w:r>
+    </w:p>
+    <w:p>
+      <w:r>
+        <w:t xml:space="preserve">  How do I update 'Security' to the latest </w:t>
+      </w:r>
+      <w:proofErr w:type="gramStart"/>
+      <w:r>
+        <w:t>and also</w:t>
+      </w:r>
+      <w:proofErr w:type="gramEnd"/>
+      <w:r>
+        <w:t xml:space="preserve"> so it can be used with '</w:t>
+      </w:r>
+      <w:proofErr w:type="spellStart"/>
+      <w:r>
+        <w:t>TaskMan</w:t>
+      </w:r>
+      <w:proofErr w:type="spellEnd"/>
+      <w:r>
+        <w:t>'?</w:t>
       </w:r>
     </w:p>
     <w:p/>
@@ -208,30 +582,83 @@
     <w:p/>
     <w:p>
       <w:r>
-        <w:t>Only Utils.csproj consumes it, and that's the complete source — good, this is a self-contained, low-risk piece.</w:t>
-      </w:r>
-    </w:p>
-    <w:p/>
-    <w:p>
-      <w:r>
-        <w:t xml:space="preserve">  What "Security" actually is</w:t>
-      </w:r>
-    </w:p>
-    <w:p/>
-    <w:p>
-      <w:r>
-        <w:t xml:space="preserve">  I read through Security.cpp/SecurityInternal.cpp — it's a C++/CLI wrapper (CLRSupport=true, "ManagedCProj") around ~100 lines of pure algorithmic code:</w:t>
-      </w:r>
-    </w:p>
-    <w:p/>
-    <w:p>
-      <w:r>
-        <w:t xml:space="preserve">  - Encrypt/Decrypt — a rolling character-substitution cipher over wchar_t strings.</w:t>
-      </w:r>
-    </w:p>
-    <w:p>
-      <w:r>
-        <w:t xml:space="preserve">  - EncryptBytes/DecryptBytes — a rolling XOR cipher over a byte array.</w:t>
+        <w:t xml:space="preserve">Only </w:t>
+      </w:r>
+      <w:proofErr w:type="spellStart"/>
+      <w:r>
+        <w:t>Utils.csproj</w:t>
+      </w:r>
+      <w:proofErr w:type="spellEnd"/>
+      <w:r>
+        <w:t xml:space="preserve"> consumes it, and that's the complete source — good, this is a self-contained, low-risk piece.</w:t>
+      </w:r>
+    </w:p>
+    <w:p/>
+    <w:p>
+      <w:r>
+        <w:t xml:space="preserve">  What "Security" </w:t>
+      </w:r>
+      <w:proofErr w:type="gramStart"/>
+      <w:r>
+        <w:t>actually is</w:t>
+      </w:r>
+      <w:proofErr w:type="gramEnd"/>
+    </w:p>
+    <w:p/>
+    <w:p>
+      <w:r>
+        <w:t xml:space="preserve">  I read through Security.cpp/SecurityInternal.cpp — it's a C++/CLI wrapper (</w:t>
+      </w:r>
+      <w:proofErr w:type="spellStart"/>
+      <w:r>
+        <w:t>CLRSupport</w:t>
+      </w:r>
+      <w:proofErr w:type="spellEnd"/>
+      <w:r>
+        <w:t>=true, "</w:t>
+      </w:r>
+      <w:proofErr w:type="spellStart"/>
+      <w:r>
+        <w:t>ManagedCProj</w:t>
+      </w:r>
+      <w:proofErr w:type="spellEnd"/>
+      <w:r>
+        <w:t>") around ~100 lines of pure algorithmic code:</w:t>
+      </w:r>
+    </w:p>
+    <w:p/>
+    <w:p>
+      <w:r>
+        <w:t xml:space="preserve">  - Encrypt/Decrypt — a rolling character-substitution cipher over </w:t>
+      </w:r>
+      <w:proofErr w:type="spellStart"/>
+      <w:r>
+        <w:t>wchar_t</w:t>
+      </w:r>
+      <w:proofErr w:type="spellEnd"/>
+      <w:r>
+        <w:t xml:space="preserve"> strings.</w:t>
+      </w:r>
+    </w:p>
+    <w:p>
+      <w:r>
+        <w:t xml:space="preserve">  - </w:t>
+      </w:r>
+      <w:proofErr w:type="spellStart"/>
+      <w:r>
+        <w:t>EncryptBytes</w:t>
+      </w:r>
+      <w:proofErr w:type="spellEnd"/>
+      <w:r>
+        <w:t>/</w:t>
+      </w:r>
+      <w:proofErr w:type="spellStart"/>
+      <w:r>
+        <w:t>DecryptBytes</w:t>
+      </w:r>
+      <w:proofErr w:type="spellEnd"/>
+      <w:r>
+        <w:t xml:space="preserve"> — a rolling XOR cipher over a byte array.</w:t>
       </w:r>
     </w:p>
     <w:p/>
@@ -242,12 +669,60 @@
     </w:p>
     <w:p>
       <w:r>
-        <w:t xml:space="preserve">  standard C++/CLI string-marshaling boilerplate (pin_ptr, PtrToStringChars). It's C++ syntax, but it's 100% safe managed logic. (Side note, not urgent: this</w:t>
-      </w:r>
-    </w:p>
-    <w:p>
-      <w:r>
-        <w:t xml:space="preserve">  is a fixed, keyless substitution/XOR cipher, not real cryptography — worth knowing if Encrypt/Decrypt is protecting anything you actually care about being</w:t>
+        <w:t xml:space="preserve">  standard C++/CLI string-</w:t>
+      </w:r>
+      <w:proofErr w:type="spellStart"/>
+      <w:r>
+        <w:t>marshaling</w:t>
+      </w:r>
+      <w:proofErr w:type="spellEnd"/>
+      <w:r>
+        <w:t xml:space="preserve"> boilerplate (</w:t>
+      </w:r>
+      <w:proofErr w:type="spellStart"/>
+      <w:r>
+        <w:t>pin_ptr</w:t>
+      </w:r>
+      <w:proofErr w:type="spellEnd"/>
+      <w:r>
+        <w:t xml:space="preserve">, </w:t>
+      </w:r>
+      <w:proofErr w:type="spellStart"/>
+      <w:r>
+        <w:t>PtrToStringChars</w:t>
+      </w:r>
+      <w:proofErr w:type="spellEnd"/>
+      <w:r>
+        <w:t>)</w:t>
+      </w:r>
+      <w:proofErr w:type="gramStart"/>
+      <w:r>
+        <w:t xml:space="preserve">. </w:t>
+      </w:r>
+      <w:proofErr w:type="gramEnd"/>
+      <w:r>
+        <w:t>It's C++ syntax, but it's 100% safe managed logic</w:t>
+      </w:r>
+      <w:proofErr w:type="gramStart"/>
+      <w:r>
+        <w:t xml:space="preserve">. </w:t>
+      </w:r>
+      <w:proofErr w:type="gramEnd"/>
+      <w:r>
+        <w:t>(Side note, not urgent: this</w:t>
+      </w:r>
+    </w:p>
+    <w:p>
+      <w:r>
+        <w:t xml:space="preserve">  is a fixed, keyless substitution/XOR cipher, not real cryptography — worth knowing if Encrypt/Decrypt is protecting anything you </w:t>
+      </w:r>
+      <w:proofErr w:type="gramStart"/>
+      <w:r>
+        <w:t>actually care</w:t>
+      </w:r>
+      <w:proofErr w:type="gramEnd"/>
+      <w:r>
+        <w:t xml:space="preserve"> about being</w:t>
       </w:r>
     </w:p>
     <w:p>
@@ -265,12 +740,52 @@
     <w:p/>
     <w:p>
       <w:r>
-        <w:t xml:space="preserve">  Option A — retarget the C++/CLI project. Install the VS2022 "C++/CLI support for v143 build tools" (and, since you want latest .NET rather than .NET</w:t>
-      </w:r>
-    </w:p>
-    <w:p>
-      <w:r>
-        <w:t xml:space="preserve">  Framework, also the ".NET Core" C++/CLI component), bump PlatformToolset to v143, retarget TargetFrameworkVersion/CLRSupport to net8.0. Workable, but it's a</w:t>
+        <w:t xml:space="preserve">  Option A — retarget the C++/CLI project</w:t>
+      </w:r>
+      <w:proofErr w:type="gramStart"/>
+      <w:r>
+        <w:t xml:space="preserve">. </w:t>
+      </w:r>
+      <w:proofErr w:type="gramEnd"/>
+      <w:r>
+        <w:t>Install the VS2022 "C++/CLI support for v143 build tools" (and, since you want latest .NET rather than .NET</w:t>
+      </w:r>
+    </w:p>
+    <w:p>
+      <w:r>
+        <w:t xml:space="preserve">  Framework, also the ".NET Core" C++/CLI component), bump </w:t>
+      </w:r>
+      <w:proofErr w:type="spellStart"/>
+      <w:r>
+        <w:t>PlatformToolset</w:t>
+      </w:r>
+      <w:proofErr w:type="spellEnd"/>
+      <w:r>
+        <w:t xml:space="preserve"> to v143, retarget </w:t>
+      </w:r>
+      <w:proofErr w:type="spellStart"/>
+      <w:r>
+        <w:t>TargetFrameworkVersion</w:t>
+      </w:r>
+      <w:proofErr w:type="spellEnd"/>
+      <w:r>
+        <w:t>/</w:t>
+      </w:r>
+      <w:proofErr w:type="spellStart"/>
+      <w:r>
+        <w:t>CLRSupport</w:t>
+      </w:r>
+      <w:proofErr w:type="spellEnd"/>
+      <w:r>
+        <w:t xml:space="preserve"> to net8.0</w:t>
+      </w:r>
+      <w:proofErr w:type="gramStart"/>
+      <w:r>
+        <w:t xml:space="preserve">. </w:t>
+      </w:r>
+      <w:proofErr w:type="gramEnd"/>
+      <w:r>
+        <w:t>Workable, but it's a</w:t>
       </w:r>
     </w:p>
     <w:p>
@@ -281,17 +796,49 @@
     <w:p/>
     <w:p>
       <w:r>
-        <w:t xml:space="preserve">  Option B — port it to C# (recommended). Since none of the logic touches unmanaged memory or native APIs, it translates 1:1 into a small SDK-style C# class</w:t>
-      </w:r>
-    </w:p>
-    <w:p>
-      <w:r>
-        <w:t xml:space="preserve">  library — same namespace (Security), same class (Functions), same four method signatures — so Utils.csproj just swaps its binary hint-path reference for a</w:t>
-      </w:r>
-    </w:p>
-    <w:p>
-      <w:r>
-        <w:t xml:space="preserve">  normal ProjectReference, no call sites elsewhere change. It becomes a first-class project in the solution/build graph instead of a stray prebuilt DLL, and</w:t>
+        <w:t xml:space="preserve">  Option B — port it to C# (recommended)</w:t>
+      </w:r>
+      <w:proofErr w:type="gramStart"/>
+      <w:r>
+        <w:t xml:space="preserve">. </w:t>
+      </w:r>
+      <w:proofErr w:type="gramEnd"/>
+      <w:r>
+        <w:t>Since none of the logic touches unmanaged memory or native APIs, it translates 1:1 into a small SDK-style C# class</w:t>
+      </w:r>
+    </w:p>
+    <w:p>
+      <w:r>
+        <w:t xml:space="preserve">  library — same namespace (Security), same class (Functions), same four method signatures — so </w:t>
+      </w:r>
+      <w:proofErr w:type="spellStart"/>
+      <w:r>
+        <w:t>Utils.csproj</w:t>
+      </w:r>
+      <w:proofErr w:type="spellEnd"/>
+      <w:r>
+        <w:t xml:space="preserve"> just swaps its binary hint-path reference for a</w:t>
+      </w:r>
+    </w:p>
+    <w:p>
+      <w:r>
+        <w:t xml:space="preserve">  normal </w:t>
+      </w:r>
+      <w:proofErr w:type="spellStart"/>
+      <w:r>
+        <w:t>ProjectReference</w:t>
+      </w:r>
+      <w:proofErr w:type="spellEnd"/>
+      <w:r>
+        <w:t>, no call sites elsewhere change</w:t>
+      </w:r>
+      <w:proofErr w:type="gramStart"/>
+      <w:r>
+        <w:t xml:space="preserve">. </w:t>
+      </w:r>
+      <w:proofErr w:type="gramEnd"/>
+      <w:r>
+        <w:t>It becomes a first-class project in the solution/build graph instead of a stray prebuilt DLL, and</w:t>
       </w:r>
     </w:p>
     <w:p>
@@ -307,7 +854,15 @@
     </w:p>
     <w:p>
       <w:r>
-        <w:t xml:space="preserve">  Want me to go ahead and write the C# Security project and wire it into TaskMan.sln as a ProjectReference from Utils?</w:t>
+        <w:t xml:space="preserve">  Want me to go ahead and write the C# Security project and wire it into TaskMan.sln as a </w:t>
+      </w:r>
+      <w:proofErr w:type="spellStart"/>
+      <w:r>
+        <w:t>ProjectReference</w:t>
+      </w:r>
+      <w:proofErr w:type="spellEnd"/>
+      <w:r>
+        <w:t xml:space="preserve"> from Utils?</w:t>
       </w:r>
     </w:p>
     <w:p/>
@@ -318,7 +873,15 @@
     </w:p>
     <w:p>
       <w:r>
-        <w:t>Yes, create a new C# SDK-style class library for the current 'Security' and name it 'SimpleSecurity' and wire it into the current 'Utils' so it works with</w:t>
+        <w:t>Yes, create a new C# SDK-style class library for the current 'Security' and name it '</w:t>
+      </w:r>
+      <w:proofErr w:type="spellStart"/>
+      <w:r>
+        <w:t>SimpleSecurity</w:t>
+      </w:r>
+      <w:proofErr w:type="spellEnd"/>
+      <w:r>
+        <w:t>' and wire it into the current 'Utils' so it works with</w:t>
       </w:r>
     </w:p>
     <w:p>
@@ -328,7 +891,15 @@
     </w:p>
     <w:p>
       <w:r>
-        <w:t xml:space="preserve">  We'll need to think about moving everything to the latest .Net (not .Net Framework), but to start, just focus on 'SimpleSecurity' as a C# solution/project and getting 'Utils' to work with it.</w:t>
+        <w:t xml:space="preserve">  We'll need to think about moving everything to the latest .Net (not .Net Framework), but to start, just focus on '</w:t>
+      </w:r>
+      <w:proofErr w:type="spellStart"/>
+      <w:r>
+        <w:t>SimpleSecurity</w:t>
+      </w:r>
+      <w:proofErr w:type="spellEnd"/>
+      <w:r>
+        <w:t>' as a C# solution/project and getting 'Utils' to work with it.</w:t>
       </w:r>
     </w:p>
     <w:p>
@@ -339,7 +910,31 @@
     <w:p/>
     <w:p>
       <w:r>
-        <w:t>Good — bin/ and obj/ are gitignored, so the new project's build output won't accidentally get staged. Everything is in order and I haven't committed anything (per convention, only on request).</w:t>
+        <w:t xml:space="preserve">Good — bin/ and </w:t>
+      </w:r>
+      <w:proofErr w:type="spellStart"/>
+      <w:r>
+        <w:t>obj</w:t>
+      </w:r>
+      <w:proofErr w:type="spellEnd"/>
+      <w:r>
+        <w:t xml:space="preserve">/ are </w:t>
+      </w:r>
+      <w:proofErr w:type="spellStart"/>
+      <w:r>
+        <w:t>gitignored</w:t>
+      </w:r>
+      <w:proofErr w:type="spellEnd"/>
+      <w:r>
+        <w:t>, so the new project's build output won't accidentally get staged</w:t>
+      </w:r>
+      <w:proofErr w:type="gramStart"/>
+      <w:r>
+        <w:t xml:space="preserve">. </w:t>
+      </w:r>
+      <w:proofErr w:type="gramEnd"/>
+      <w:r>
+        <w:t>Everything is in order and I haven't committed anything (per convention, only on request).</w:t>
       </w:r>
     </w:p>
     <w:p/>
@@ -351,12 +946,76 @@
     <w:p/>
     <w:p>
       <w:r>
-        <w:t xml:space="preserve">  New project: V1/Libs/SimpleSecurity/ — an SDK-style netstandard2.0 class library (SimpleSecurity.sln + SimpleSecurity.csproj), with Functions.cs a line-by-line C# port of the original C++/CLI</w:t>
-      </w:r>
-    </w:p>
-    <w:p>
-      <w:r>
-        <w:t xml:space="preserve">  Security::Functions class, same namespace Security { public static class Functions } shape. I verified it's byte-for-byte compatible with the original DLL by loading a prebuilt copy of the old</w:t>
+        <w:t xml:space="preserve">  New project: V1/Libs/</w:t>
+      </w:r>
+      <w:proofErr w:type="spellStart"/>
+      <w:r>
+        <w:t>SimpleSecurity</w:t>
+      </w:r>
+      <w:proofErr w:type="spellEnd"/>
+      <w:r>
+        <w:t xml:space="preserve">/ — an SDK-style netstandard2.0 class library (SimpleSecurity.sln + </w:t>
+      </w:r>
+      <w:proofErr w:type="spellStart"/>
+      <w:r>
+        <w:t>SimpleSecurity.csproj</w:t>
+      </w:r>
+      <w:proofErr w:type="spellEnd"/>
+      <w:r>
+        <w:t xml:space="preserve">), with </w:t>
+      </w:r>
+      <w:proofErr w:type="spellStart"/>
+      <w:r>
+        <w:t>Functions.cs</w:t>
+      </w:r>
+      <w:proofErr w:type="spellEnd"/>
+      <w:r>
+        <w:t xml:space="preserve"> a line-by-line C# port of the original C++/CLI</w:t>
+      </w:r>
+    </w:p>
+    <w:p>
+      <w:r>
+        <w:t xml:space="preserve">  </w:t>
+      </w:r>
+      <w:proofErr w:type="gramStart"/>
+      <w:r>
+        <w:t>Security::</w:t>
+      </w:r>
+      <w:proofErr w:type="gramEnd"/>
+      <w:r>
+        <w:t xml:space="preserve">Functions class, same namespace Security </w:t>
+      </w:r>
+      <w:proofErr w:type="gramStart"/>
+      <w:r>
+        <w:t>{ public</w:t>
+      </w:r>
+      <w:proofErr w:type="gramEnd"/>
+      <w:r>
+        <w:t xml:space="preserve"> static class </w:t>
+      </w:r>
+      <w:proofErr w:type="gramStart"/>
+      <w:r>
+        <w:t>Functions }</w:t>
+      </w:r>
+      <w:proofErr w:type="gramEnd"/>
+      <w:r>
+        <w:t xml:space="preserve"> shape</w:t>
+      </w:r>
+      <w:proofErr w:type="gramStart"/>
+      <w:r>
+        <w:t xml:space="preserve">. </w:t>
+      </w:r>
+      <w:proofErr w:type="gramEnd"/>
+      <w:r>
+        <w:t xml:space="preserve">I verified </w:t>
+      </w:r>
+      <w:proofErr w:type="gramStart"/>
+      <w:r>
+        <w:t>it's</w:t>
+      </w:r>
+      <w:proofErr w:type="gramEnd"/>
+      <w:r>
+        <w:t xml:space="preserve"> byte-for-byte compatible with the original DLL by loading a prebuilt copy of the old</w:t>
       </w:r>
     </w:p>
     <w:p>
@@ -367,7 +1026,33 @@
     <w:p/>
     <w:p>
       <w:r>
-        <w:t xml:space="preserve">  Wired into Utils: swapped the Security.dll hint-path &lt;Reference&gt; for a &lt;ProjectReference&gt; to SimpleSecurity. SecurityFunctions.cs — the only consumer in the whole solution — needed zero code</w:t>
+        <w:t xml:space="preserve">  Wired into Utils: swapped the Security.dll hint-path &lt;Reference&gt; for a &lt;</w:t>
+      </w:r>
+      <w:proofErr w:type="spellStart"/>
+      <w:r>
+        <w:t>ProjectReference</w:t>
+      </w:r>
+      <w:proofErr w:type="spellEnd"/>
+      <w:r>
+        <w:t xml:space="preserve">&gt; to </w:t>
+      </w:r>
+      <w:proofErr w:type="spellStart"/>
+      <w:r>
+        <w:t>SimpleSecurity</w:t>
+      </w:r>
+      <w:proofErr w:type="spellEnd"/>
+      <w:proofErr w:type="gramStart"/>
+      <w:r>
+        <w:t xml:space="preserve">. </w:t>
+      </w:r>
+      <w:proofErr w:type="spellStart"/>
+      <w:proofErr w:type="gramEnd"/>
+      <w:r>
+        <w:t>SecurityFunctions.cs</w:t>
+      </w:r>
+      <w:proofErr w:type="spellEnd"/>
+      <w:r>
+        <w:t xml:space="preserve"> — the only consumer in the whole solution — needed zero code</w:t>
       </w:r>
     </w:p>
     <w:p>
@@ -383,12 +1068,68 @@
     </w:p>
     <w:p>
       <w:r>
-        <w:t xml:space="preserve">  meant every project that depends on Utils (CustomGUIControls, DBAccess, DBTaskMan, PlanDisplay, TaskMan) also needed the same one-line TargetFrameworkVersion bump, since .NET Framework refuses</w:t>
-      </w:r>
-    </w:p>
-    <w:p>
-      <w:r>
-        <w:t xml:space="preserve">  references to assemblies built against a higher version. This is just moving everyone to the top of the .NET Framework 4.x ladder (purely additive, no API removals) — not the eventual .NET 8</w:t>
+        <w:t xml:space="preserve">  meant every project that depends on Utils (</w:t>
+      </w:r>
+      <w:proofErr w:type="spellStart"/>
+      <w:r>
+        <w:t>CustomGUIControls</w:t>
+      </w:r>
+      <w:proofErr w:type="spellEnd"/>
+      <w:r>
+        <w:t xml:space="preserve">, </w:t>
+      </w:r>
+      <w:proofErr w:type="spellStart"/>
+      <w:r>
+        <w:t>DBAccess</w:t>
+      </w:r>
+      <w:proofErr w:type="spellEnd"/>
+      <w:r>
+        <w:t xml:space="preserve">, </w:t>
+      </w:r>
+      <w:proofErr w:type="spellStart"/>
+      <w:r>
+        <w:t>DBTaskMan</w:t>
+      </w:r>
+      <w:proofErr w:type="spellEnd"/>
+      <w:r>
+        <w:t xml:space="preserve">, </w:t>
+      </w:r>
+      <w:proofErr w:type="spellStart"/>
+      <w:r>
+        <w:t>PlanDisplay</w:t>
+      </w:r>
+      <w:proofErr w:type="spellEnd"/>
+      <w:r>
+        <w:t xml:space="preserve">, </w:t>
+      </w:r>
+      <w:proofErr w:type="spellStart"/>
+      <w:r>
+        <w:t>TaskMan</w:t>
+      </w:r>
+      <w:proofErr w:type="spellEnd"/>
+      <w:r>
+        <w:t xml:space="preserve">) also needed the same one-line </w:t>
+      </w:r>
+      <w:proofErr w:type="spellStart"/>
+      <w:r>
+        <w:t>TargetFrameworkVersion</w:t>
+      </w:r>
+      <w:proofErr w:type="spellEnd"/>
+      <w:r>
+        <w:t xml:space="preserve"> bump, since .NET Framework refuses</w:t>
+      </w:r>
+    </w:p>
+    <w:p>
+      <w:r>
+        <w:t xml:space="preserve">  references to assemblies built against a higher version</w:t>
+      </w:r>
+      <w:proofErr w:type="gramStart"/>
+      <w:r>
+        <w:t xml:space="preserve">. </w:t>
+      </w:r>
+      <w:proofErr w:type="gramEnd"/>
+      <w:r>
+        <w:t>This is just moving everyone to the top of the .NET Framework 4.x ladder (purely additive, no API removals) — not the eventual .NET 8</w:t>
       </w:r>
     </w:p>
     <w:p>
@@ -399,7 +1140,15 @@
     <w:p/>
     <w:p>
       <w:r>
-        <w:t xml:space="preserve">  Verified: full TaskMan.sln rebuilds clean via real MSBuild (0 errors, only one pre-existing unrelated warning), producing ProjectPal.exe.</w:t>
+        <w:t xml:space="preserve">  Verified: full TaskMan.sln rebuilds clean via real </w:t>
+      </w:r>
+      <w:proofErr w:type="spellStart"/>
+      <w:r>
+        <w:t>MSBuild</w:t>
+      </w:r>
+      <w:proofErr w:type="spellEnd"/>
+      <w:r>
+        <w:t xml:space="preserve"> (0 errors, only one pre-existing unrelated warning), producing ProjectPal.exe.</w:t>
       </w:r>
     </w:p>
     <w:p/>
@@ -411,17 +1160,49 @@
     <w:p>
       <w:r>
         <w:lastRenderedPageBreak/>
-        <w:t xml:space="preserve">  - Libs/Security/ (the old C++/CLI project) and Libs/NomuraUtils/ (an unrelated stray duplicate) weren't touched — neither is part of TaskMan.sln.</w:t>
-      </w:r>
-    </w:p>
-    <w:p>
-      <w:r>
-        <w:t xml:space="preserve">  - The old Security.dll binaries still sit in various bin/ folders; harmless, and gitignored.</w:t>
-      </w:r>
-    </w:p>
-    <w:p>
-      <w:r>
-        <w:t xml:space="preserve">  - SimpleSecurity is deliberately netstandard2.0 rather than net48, so when you're ready to move Utils and the rest to real modern .NET (net8.0-windows), SimpleSecurity won't need to change at all.</w:t>
+        <w:t xml:space="preserve">  - Libs/Security/ (the old C++/CLI project) and Libs/</w:t>
+      </w:r>
+      <w:proofErr w:type="spellStart"/>
+      <w:r>
+        <w:t>NomuraUtils</w:t>
+      </w:r>
+      <w:proofErr w:type="spellEnd"/>
+      <w:r>
+        <w:t>/ (an unrelated stray duplicate) weren't touched — neither is part of TaskMan.sln.</w:t>
+      </w:r>
+    </w:p>
+    <w:p>
+      <w:r>
+        <w:t xml:space="preserve">  - The old Security.dll binaries still sit in various bin/ folders; harmless, and </w:t>
+      </w:r>
+      <w:proofErr w:type="spellStart"/>
+      <w:r>
+        <w:t>gitignored</w:t>
+      </w:r>
+      <w:proofErr w:type="spellEnd"/>
+      <w:r>
+        <w:t>.</w:t>
+      </w:r>
+    </w:p>
+    <w:p>
+      <w:r>
+        <w:t xml:space="preserve">  - </w:t>
+      </w:r>
+      <w:proofErr w:type="spellStart"/>
+      <w:r>
+        <w:t>SimpleSecurity</w:t>
+      </w:r>
+      <w:proofErr w:type="spellEnd"/>
+      <w:r>
+        <w:t xml:space="preserve"> is deliberately netstandard2.0 rather than net48, so when you're ready to move Utils and the rest to real modern .NET (net8.0-windows), </w:t>
+      </w:r>
+      <w:proofErr w:type="spellStart"/>
+      <w:r>
+        <w:t>SimpleSecurity</w:t>
+      </w:r>
+      <w:proofErr w:type="spellEnd"/>
+      <w:r>
+        <w:t xml:space="preserve"> won't need to change at all.</w:t>
       </w:r>
     </w:p>
     <w:p/>
@@ -446,7 +1227,23 @@
     <w:p/>
     <w:p>
       <w:r>
-        <w:t>/desktop – continue conversation with Calude Desktop</w:t>
+        <w:t>/</w:t>
+      </w:r>
+      <w:proofErr w:type="gramStart"/>
+      <w:r>
+        <w:t>desktop</w:t>
+      </w:r>
+      <w:proofErr w:type="gramEnd"/>
+      <w:r>
+        <w:t xml:space="preserve"> – continue conversation with </w:t>
+      </w:r>
+      <w:proofErr w:type="spellStart"/>
+      <w:r>
+        <w:t>Calude</w:t>
+      </w:r>
+      <w:proofErr w:type="spellEnd"/>
+      <w:r>
+        <w:t xml:space="preserve"> Desktop</w:t>
       </w:r>
     </w:p>
     <w:sectPr>
@@ -1062,6 +1859,7 @@
   <w:style w:type="character" w:default="1" w:styleId="DefaultParagraphFont">
     <w:name w:val="Default Paragraph Font"/>
     <w:uiPriority w:val="1"/>
+    <w:semiHidden/>
     <w:unhideWhenUsed/>
   </w:style>
   <w:style w:type="table" w:default="1" w:styleId="TableNormal">

</xml_diff>